<commit_message>
Word file version 20250730
</commit_message>
<xml_diff>
--- a/Bidirectional LSTM Application for IQ imbalance Predistortion in OFDM systems.docx
+++ b/Bidirectional LSTM Application for IQ imbalance Predistortion in OFDM systems.docx
@@ -5652,7 +5652,7 @@
           <w:sz w:val="22"/>
         </w:rPr>
         <w:drawing>
-          <wp:inline distT="0" distB="0" distL="0" distR="0">
+          <wp:inline distT="0" distB="0" distL="0" distR="0" wp14:anchorId="08F681CD" wp14:editId="73DE547C">
             <wp:extent cx="4785360" cy="2827020"/>
             <wp:effectExtent l="0" t="0" r="0" b="0"/>
             <wp:docPr id="10" name="그림 10" descr="EMB00002ff043a7"/>
@@ -9555,7 +9555,7 @@
         </w:rPr>
         <w:lastRenderedPageBreak/>
         <w:drawing>
-          <wp:inline distT="0" distB="0" distL="0" distR="0">
+          <wp:inline distT="0" distB="0" distL="0" distR="0" wp14:anchorId="335C1009" wp14:editId="6DDFEDD4">
             <wp:extent cx="5402580" cy="3627120"/>
             <wp:effectExtent l="0" t="0" r="7620" b="0"/>
             <wp:docPr id="3" name="그림 3" descr="EMB00002ff043b5"/>
@@ -11433,7 +11433,7 @@
         <w:rPr>
           <w:highlight w:val="yellow"/>
         </w:rPr>
-        <w:object w:dxaOrig="17041" w:dyaOrig="8986">
+        <w:object w:dxaOrig="17041" w:dyaOrig="8986" w14:anchorId="42B3BF93">
           <v:shapetype id="_x0000_t75" coordsize="21600,21600" o:spt="75" o:preferrelative="t" path="m@4@5l@4@11@9@11@9@5xe" filled="f" stroked="f">
             <v:stroke joinstyle="miter"/>
             <v:formulas>
@@ -11456,7 +11456,7 @@
           <v:shape id="_x0000_i1025" type="#_x0000_t75" style="width:450.75pt;height:237.75pt" o:ole="">
             <v:imagedata r:id="rId10" o:title=""/>
           </v:shape>
-          <o:OLEObject Type="Embed" ProgID="Visio.Drawing.15" ShapeID="_x0000_i1025" DrawAspect="Content" ObjectID="_1814556621" r:id="rId11"/>
+          <o:OLEObject Type="Embed" ProgID="Visio.Drawing.15" ShapeID="_x0000_i1025" DrawAspect="Content" ObjectID="_1815404395" r:id="rId11"/>
         </w:object>
       </w:r>
     </w:p>
@@ -11661,16 +11661,7 @@
           <w:rFonts w:ascii="Times New Roman" w:hAnsi="Times New Roman" w:cs="Times New Roman"/>
           <w:sz w:val="22"/>
         </w:rPr>
-        <w:t>up-</w:t>
-      </w:r>
-      <w:bookmarkStart w:id="0" w:name="_GoBack"/>
-      <w:bookmarkEnd w:id="0"/>
-      <w:r>
-        <w:rPr>
-          <w:rFonts w:ascii="Times New Roman" w:hAnsi="Times New Roman" w:cs="Times New Roman"/>
-          <w:sz w:val="22"/>
-        </w:rPr>
-        <w:t>conversion</w:t>
+        <w:t>up-conversion</w:t>
       </w:r>
       <w:r>
         <w:rPr>
@@ -15294,7 +15285,7 @@
         <w:autoSpaceDN/>
         <w:spacing w:before="100" w:beforeAutospacing="1" w:after="100" w:afterAutospacing="1" w:line="240" w:lineRule="auto"/>
         <w:rPr>
-          <w:rFonts w:ascii="Times New Roman" w:hAnsi="Times New Roman" w:cs="Times New Roman" w:hint="eastAsia"/>
+          <w:rFonts w:ascii="Times New Roman" w:hAnsi="Times New Roman" w:cs="Times New Roman"/>
           <w:kern w:val="0"/>
           <w:sz w:val="22"/>
         </w:rPr>
@@ -18619,6 +18610,7 @@
         </w:rPr>
         <w:t xml:space="preserve"> </w:t>
       </w:r>
+      <w:commentRangeStart w:id="0"/>
       <w:r>
         <w:rPr>
           <w:rFonts w:ascii="Times New Roman" w:eastAsiaTheme="minorEastAsia" w:hAnsi="Times New Roman" w:cs="Times New Roman"/>
@@ -18626,6 +18618,16 @@
           <w:szCs w:val="22"/>
         </w:rPr>
         <w:t>된다</w:t>
+      </w:r>
+      <w:commentRangeEnd w:id="0"/>
+      <w:r>
+        <w:rPr>
+          <w:rStyle w:val="aa"/>
+          <w:rFonts w:asciiTheme="minorHAnsi" w:eastAsiaTheme="minorEastAsia" w:hAnsiTheme="minorHAnsi" w:cstheme="minorBidi"/>
+          <w:color w:val="auto"/>
+          <w:kern w:val="2"/>
+        </w:rPr>
+        <w:commentReference w:id="0"/>
       </w:r>
       <w:r>
         <w:rPr>
@@ -18646,6 +18648,8 @@
           <w:szCs w:val="22"/>
         </w:rPr>
       </w:pPr>
+      <w:commentRangeStart w:id="1"/>
+      <w:commentRangeStart w:id="2"/>
       <w:r>
         <w:rPr>
           <w:rFonts w:ascii="Times New Roman" w:eastAsiaTheme="minorEastAsia" w:hAnsi="Times New Roman" w:cs="Times New Roman"/>
@@ -19932,6 +19936,7 @@
         <w:t>)</w:t>
       </w:r>
     </w:p>
+    <w:commentRangeEnd w:id="1"/>
     <w:p>
       <w:pPr>
         <w:pStyle w:val="a3"/>
@@ -19942,6 +19947,25 @@
           <w:szCs w:val="22"/>
         </w:rPr>
       </w:pPr>
+      <w:r>
+        <w:rPr>
+          <w:rStyle w:val="aa"/>
+          <w:rFonts w:asciiTheme="minorHAnsi" w:eastAsiaTheme="minorEastAsia" w:hAnsiTheme="minorHAnsi" w:cstheme="minorBidi"/>
+          <w:color w:val="auto"/>
+          <w:kern w:val="2"/>
+        </w:rPr>
+        <w:commentReference w:id="1"/>
+      </w:r>
+      <w:commentRangeEnd w:id="2"/>
+      <w:r>
+        <w:rPr>
+          <w:rStyle w:val="aa"/>
+          <w:rFonts w:asciiTheme="minorHAnsi" w:eastAsiaTheme="minorEastAsia" w:hAnsiTheme="minorHAnsi" w:cstheme="minorBidi"/>
+          <w:color w:val="auto"/>
+          <w:kern w:val="2"/>
+        </w:rPr>
+        <w:commentReference w:id="2"/>
+      </w:r>
     </w:p>
     <w:p>
       <w:pPr>
@@ -20979,6 +21003,8 @@
           <w:szCs w:val="22"/>
         </w:rPr>
       </w:pPr>
+      <w:commentRangeStart w:id="3"/>
+      <w:commentRangeStart w:id="4"/>
       <w:r>
         <w:rPr>
           <w:rFonts w:ascii="Times New Roman" w:eastAsiaTheme="minorEastAsia" w:hAnsi="Times New Roman" w:cs="Times New Roman"/>
@@ -21394,6 +21420,26 @@
           <w:szCs w:val="22"/>
         </w:rPr>
         <w:t xml:space="preserve">. </w:t>
+      </w:r>
+      <w:commentRangeEnd w:id="3"/>
+      <w:r>
+        <w:rPr>
+          <w:rStyle w:val="aa"/>
+          <w:rFonts w:asciiTheme="minorHAnsi" w:eastAsiaTheme="minorEastAsia" w:hAnsiTheme="minorHAnsi" w:cstheme="minorBidi"/>
+          <w:color w:val="auto"/>
+          <w:kern w:val="2"/>
+        </w:rPr>
+        <w:commentReference w:id="3"/>
+      </w:r>
+      <w:commentRangeEnd w:id="4"/>
+      <w:r>
+        <w:rPr>
+          <w:rStyle w:val="aa"/>
+          <w:rFonts w:asciiTheme="minorHAnsi" w:eastAsiaTheme="minorEastAsia" w:hAnsiTheme="minorHAnsi" w:cstheme="minorBidi"/>
+          <w:color w:val="auto"/>
+          <w:kern w:val="2"/>
+        </w:rPr>
+        <w:commentReference w:id="4"/>
       </w:r>
       <w:r>
         <w:rPr>
@@ -21840,11 +21886,11 @@
         </w:rPr>
       </w:pPr>
       <w:r>
-        <w:object w:dxaOrig="17265" w:dyaOrig="7350">
+        <w:object w:dxaOrig="17265" w:dyaOrig="7350" w14:anchorId="04C93110">
           <v:shape id="_x0000_i1026" type="#_x0000_t75" style="width:450.75pt;height:192pt" o:ole="">
-            <v:imagedata r:id="rId12" o:title=""/>
+            <v:imagedata r:id="rId14" o:title=""/>
           </v:shape>
-          <o:OLEObject Type="Embed" ProgID="Visio.Drawing.15" ShapeID="_x0000_i1026" DrawAspect="Content" ObjectID="_1814556622" r:id="rId13"/>
+          <o:OLEObject Type="Embed" ProgID="Visio.Drawing.15" ShapeID="_x0000_i1026" DrawAspect="Content" ObjectID="_1815404396" r:id="rId15"/>
         </w:object>
       </w:r>
     </w:p>
@@ -21929,6 +21975,8 @@
           <w:szCs w:val="22"/>
         </w:rPr>
       </w:pPr>
+      <w:commentRangeStart w:id="5"/>
+      <w:commentRangeStart w:id="6"/>
       <w:r>
         <w:rPr>
           <w:rFonts w:ascii="Times New Roman" w:eastAsiaTheme="minorEastAsia" w:hAnsi="Times New Roman" w:cs="Times New Roman"/>
@@ -22240,6 +22288,26 @@
           <w:szCs w:val="22"/>
         </w:rPr>
         <w:t>.</w:t>
+      </w:r>
+      <w:commentRangeEnd w:id="5"/>
+      <w:r>
+        <w:rPr>
+          <w:rStyle w:val="aa"/>
+          <w:rFonts w:asciiTheme="minorHAnsi" w:eastAsiaTheme="minorEastAsia" w:hAnsiTheme="minorHAnsi" w:cstheme="minorBidi"/>
+          <w:color w:val="auto"/>
+          <w:kern w:val="2"/>
+        </w:rPr>
+        <w:commentReference w:id="5"/>
+      </w:r>
+      <w:commentRangeEnd w:id="6"/>
+      <w:r>
+        <w:rPr>
+          <w:rStyle w:val="aa"/>
+          <w:rFonts w:asciiTheme="minorHAnsi" w:eastAsiaTheme="minorEastAsia" w:hAnsiTheme="minorHAnsi" w:cstheme="minorBidi"/>
+          <w:color w:val="auto"/>
+          <w:kern w:val="2"/>
+        </w:rPr>
+        <w:commentReference w:id="6"/>
       </w:r>
     </w:p>
     <w:p>
@@ -26293,7 +26361,7 @@
           <w:szCs w:val="22"/>
         </w:rPr>
         <w:drawing>
-          <wp:anchor distT="0" distB="0" distL="114300" distR="114300" simplePos="0" relativeHeight="251658240" behindDoc="0" locked="0" layoutInCell="1" allowOverlap="1">
+          <wp:anchor distT="0" distB="0" distL="114300" distR="114300" simplePos="0" relativeHeight="251658240" behindDoc="0" locked="0" layoutInCell="1" allowOverlap="1" wp14:anchorId="356BF14E" wp14:editId="0915038C">
             <wp:simplePos x="0" y="0"/>
             <wp:positionH relativeFrom="column">
               <wp:posOffset>0</wp:posOffset>
@@ -26318,7 +26386,7 @@
                     </pic:cNvPicPr>
                   </pic:nvPicPr>
                   <pic:blipFill>
-                    <a:blip r:embed="rId14">
+                    <a:blip r:embed="rId16">
                       <a:extLst>
                         <a:ext uri="{28A0092B-C50C-407E-A947-70E740481C1C}">
                           <a14:useLocalDpi xmlns:a14="http://schemas.microsoft.com/office/drawing/2010/main" val="0"/>
@@ -26556,7 +26624,7 @@
         </w:rPr>
         <w:lastRenderedPageBreak/>
         <w:drawing>
-          <wp:inline distT="0" distB="0" distL="0" distR="0">
+          <wp:inline distT="0" distB="0" distL="0" distR="0" wp14:anchorId="0635CCE8" wp14:editId="590298DA">
             <wp:extent cx="5402580" cy="4008120"/>
             <wp:effectExtent l="0" t="0" r="0" b="0"/>
             <wp:docPr id="13" name="그림 13" descr="EMB00002ff043db"/>
@@ -26573,7 +26641,7 @@
                     </pic:cNvPicPr>
                   </pic:nvPicPr>
                   <pic:blipFill>
-                    <a:blip r:embed="rId15">
+                    <a:blip r:embed="rId17">
                       <a:extLst>
                         <a:ext uri="{28A0092B-C50C-407E-A947-70E740481C1C}">
                           <a14:useLocalDpi xmlns:a14="http://schemas.microsoft.com/office/drawing/2010/main" val="0"/>
@@ -28454,7 +28522,7 @@
         </w:rPr>
         <w:lastRenderedPageBreak/>
         <w:drawing>
-          <wp:inline distT="0" distB="0" distL="0" distR="0">
+          <wp:inline distT="0" distB="0" distL="0" distR="0" wp14:anchorId="53AEC25A" wp14:editId="7262EAC2">
             <wp:extent cx="5324475" cy="3990975"/>
             <wp:effectExtent l="0" t="0" r="0" b="9525"/>
             <wp:docPr id="4" name="그림 4"/>
@@ -28471,7 +28539,7 @@
                     </pic:cNvPicPr>
                   </pic:nvPicPr>
                   <pic:blipFill>
-                    <a:blip r:embed="rId16">
+                    <a:blip r:embed="rId18">
                       <a:extLst>
                         <a:ext uri="{28A0092B-C50C-407E-A947-70E740481C1C}">
                           <a14:useLocalDpi xmlns:a14="http://schemas.microsoft.com/office/drawing/2010/main" val="0"/>
@@ -31488,7 +31556,7 @@
           <w:szCs w:val="20"/>
         </w:rPr>
         <w:drawing>
-          <wp:inline distT="0" distB="0" distL="0" distR="0">
+          <wp:inline distT="0" distB="0" distL="0" distR="0" wp14:anchorId="57D4FC2D" wp14:editId="20DB332D">
             <wp:extent cx="5324475" cy="3990975"/>
             <wp:effectExtent l="0" t="0" r="0" b="0"/>
             <wp:docPr id="1" name="그림 1"/>
@@ -31505,7 +31573,7 @@
                     </pic:cNvPicPr>
                   </pic:nvPicPr>
                   <pic:blipFill>
-                    <a:blip r:embed="rId17">
+                    <a:blip r:embed="rId19">
                       <a:extLst>
                         <a:ext uri="{28A0092B-C50C-407E-A947-70E740481C1C}">
                           <a14:useLocalDpi xmlns:a14="http://schemas.microsoft.com/office/drawing/2010/main" val="0"/>
@@ -41256,7 +41324,7 @@
         </w:rPr>
         <w:t xml:space="preserve">, </w:t>
       </w:r>
-      <w:hyperlink r:id="rId18" w:tgtFrame="_blank" w:tooltip="Persistent link using digital object identifier" w:history="1">
+      <w:hyperlink r:id="rId20" w:tgtFrame="_blank" w:tooltip="Persistent link using digital object identifier" w:history="1">
         <w:r>
           <w:rPr>
             <w:rFonts w:ascii="Times New Roman" w:eastAsiaTheme="minorEastAsia" w:hAnsi="Times New Roman" w:cs="Times New Roman"/>
@@ -41406,6 +41474,521 @@
     </w:sectPr>
   </w:body>
 </w:document>
+</file>
+
+<file path=word/comments.xml><?xml version="1.0" encoding="utf-8"?>
+<w:comments xmlns:wpc="http://schemas.microsoft.com/office/word/2010/wordprocessingCanvas" xmlns:cx="http://schemas.microsoft.com/office/drawing/2014/chartex" xmlns:cx1="http://schemas.microsoft.com/office/drawing/2015/9/8/chartex" xmlns:mc="http://schemas.openxmlformats.org/markup-compatibility/2006" xmlns:o="urn:schemas-microsoft-com:office:office" xmlns:r="http://schemas.openxmlformats.org/officeDocument/2006/relationships" xmlns:m="http://schemas.openxmlformats.org/officeDocument/2006/math" xmlns:v="urn:schemas-microsoft-com:vml" xmlns:wp14="http://schemas.microsoft.com/office/word/2010/wordprocessingDrawing" xmlns:wp="http://schemas.openxmlformats.org/drawingml/2006/wordprocessingDrawing" xmlns:w10="urn:schemas-microsoft-com:office:word" xmlns:w="http://schemas.openxmlformats.org/wordprocessingml/2006/main" xmlns:w14="http://schemas.microsoft.com/office/word/2010/wordml" xmlns:w15="http://schemas.microsoft.com/office/word/2012/wordml" xmlns:w16se="http://schemas.microsoft.com/office/word/2015/wordml/symex" xmlns:wpg="http://schemas.microsoft.com/office/word/2010/wordprocessingGroup" xmlns:wpi="http://schemas.microsoft.com/office/word/2010/wordprocessingInk" xmlns:wne="http://schemas.microsoft.com/office/word/2006/wordml" xmlns:wps="http://schemas.microsoft.com/office/word/2010/wordprocessingShape" mc:Ignorable="w14 w15 w16se wp14">
+  <w:comment w:id="0" w:author="ADMIN" w:date="2025-07-28T08:06:00Z" w:initials="A">
+    <w:p>
+      <w:pPr>
+        <w:pStyle w:val="ab"/>
+      </w:pPr>
+      <w:r>
+        <w:rPr>
+          <w:rStyle w:val="aa"/>
+        </w:rPr>
+        <w:annotationRef/>
+      </w:r>
+      <w:r>
+        <w:rPr>
+          <w:rFonts w:hint="eastAsia"/>
+        </w:rPr>
+        <w:t>여기까지 일단 작성함</w:t>
+      </w:r>
+    </w:p>
+  </w:comment>
+  <w:comment w:id="1" w:author="ADMIN" w:date="2025-07-28T08:07:00Z" w:initials="A">
+    <w:p>
+      <w:pPr>
+        <w:pStyle w:val="ab"/>
+      </w:pPr>
+      <w:r>
+        <w:rPr>
+          <w:rStyle w:val="aa"/>
+        </w:rPr>
+        <w:annotationRef/>
+      </w:r>
+      <w:r>
+        <w:rPr>
+          <w:rFonts w:hint="eastAsia"/>
+        </w:rPr>
+        <w:t>이 부분은</w:t>
+      </w:r>
+      <w:r>
+        <w:t xml:space="preserve"> </w:t>
+      </w:r>
+      <w:r>
+        <w:rPr>
+          <w:rFonts w:hint="eastAsia"/>
+        </w:rPr>
+        <w:t>왜 들어가는 설명이에요?</w:t>
+      </w:r>
+    </w:p>
+    <w:p>
+      <w:pPr>
+        <w:pStyle w:val="ab"/>
+      </w:pPr>
+      <w:r>
+        <w:rPr>
+          <w:rFonts w:hint="eastAsia"/>
+        </w:rPr>
+        <w:t>이전 문단이랑 연결이 되는건지,</w:t>
+      </w:r>
+      <w:r>
+        <w:t xml:space="preserve"> </w:t>
+      </w:r>
+      <w:r>
+        <w:rPr>
+          <w:rFonts w:hint="eastAsia"/>
+        </w:rPr>
+        <w:t>아니면 다음 문단에 쓰이는 건지 모르겠어요</w:t>
+      </w:r>
+    </w:p>
+    <w:p>
+      <w:pPr>
+        <w:pStyle w:val="ab"/>
+      </w:pPr>
+      <w:r>
+        <w:rPr>
+          <w:rFonts w:hint="eastAsia"/>
+        </w:rPr>
+        <w:t>[</w:t>
+      </w:r>
+      <w:r>
+        <w:t xml:space="preserve">10-12] reference </w:t>
+      </w:r>
+      <w:r>
+        <w:rPr>
+          <w:rFonts w:hint="eastAsia"/>
+        </w:rPr>
+        <w:t xml:space="preserve">달린 문단에 </w:t>
+      </w:r>
+      <w:r>
+        <w:t xml:space="preserve">forward/back-ward direction </w:t>
+      </w:r>
+      <w:r>
+        <w:rPr>
+          <w:rFonts w:hint="eastAsia"/>
+        </w:rPr>
+        <w:t>설명이 나오니까 거기에 이어서 설명해야하는건가요?</w:t>
+      </w:r>
+    </w:p>
+  </w:comment>
+  <w:comment w:id="2" w:author="김진관" w:date="2025-07-30T18:07:00Z" w:initials="김">
+    <w:p>
+      <w:pPr>
+        <w:pStyle w:val="ab"/>
+      </w:pPr>
+      <w:r>
+        <w:rPr>
+          <w:rStyle w:val="aa"/>
+        </w:rPr>
+        <w:annotationRef/>
+      </w:r>
+      <w:r>
+        <w:rPr>
+          <w:rFonts w:hint="eastAsia"/>
+        </w:rPr>
+        <w:t>여기 위치가 적절함</w:t>
+      </w:r>
+    </w:p>
+  </w:comment>
+  <w:comment w:id="3" w:author="ADMIN" w:date="2025-07-28T08:08:00Z" w:initials="A">
+    <w:p>
+      <w:pPr>
+        <w:pStyle w:val="ab"/>
+      </w:pPr>
+      <w:r>
+        <w:rPr>
+          <w:rStyle w:val="aa"/>
+        </w:rPr>
+        <w:annotationRef/>
+      </w:r>
+      <w:r>
+        <w:rPr>
+          <w:rFonts w:hint="eastAsia"/>
+        </w:rPr>
+        <w:t xml:space="preserve">지금 </w:t>
+      </w:r>
+      <w:r>
+        <w:t>RF signal based IQ imbalance</w:t>
+      </w:r>
+      <w:r>
+        <w:rPr>
+          <w:rFonts w:hint="eastAsia"/>
+        </w:rPr>
+        <w:t xml:space="preserve">는 별도의 </w:t>
+      </w:r>
+      <w:r>
+        <w:t>pilot</w:t>
+      </w:r>
+      <w:r>
+        <w:rPr>
+          <w:rFonts w:hint="eastAsia"/>
+        </w:rPr>
+        <w:t xml:space="preserve">이나 </w:t>
+      </w:r>
+      <w:r>
+        <w:t>reference</w:t>
+      </w:r>
+      <w:r>
+        <w:rPr>
+          <w:rFonts w:hint="eastAsia"/>
+        </w:rPr>
+        <w:t>를 필요로 하지 않음</w:t>
+      </w:r>
+    </w:p>
+    <w:p>
+      <w:pPr>
+        <w:pStyle w:val="ab"/>
+      </w:pPr>
+      <w:r>
+        <w:rPr>
+          <w:rFonts w:hint="eastAsia"/>
+        </w:rPr>
+        <w:t xml:space="preserve">그럼 </w:t>
+      </w:r>
+      <w:r>
+        <w:t xml:space="preserve">1. </w:t>
+      </w:r>
+      <w:r>
+        <w:rPr>
+          <w:rFonts w:hint="eastAsia"/>
+        </w:rPr>
+        <w:t xml:space="preserve">비선형적인 </w:t>
+      </w:r>
+      <w:r>
+        <w:t>IQ imbalance</w:t>
+      </w:r>
+      <w:r>
+        <w:rPr>
+          <w:rFonts w:hint="eastAsia"/>
+        </w:rPr>
+        <w:t>에 효과적으로 대응할 수 있다.</w:t>
+      </w:r>
+      <w:r>
+        <w:t xml:space="preserve"> (</w:t>
+      </w:r>
+      <w:r>
+        <w:rPr>
+          <w:rFonts w:hint="eastAsia"/>
+        </w:rPr>
+        <w:t>이유는 잘 모르겠어요)</w:t>
+      </w:r>
+    </w:p>
+    <w:p>
+      <w:pPr>
+        <w:pStyle w:val="ab"/>
+        <w:rPr>
+          <w:rFonts w:hint="eastAsia"/>
+        </w:rPr>
+      </w:pPr>
+      <w:r>
+        <w:rPr>
+          <w:rFonts w:hint="eastAsia"/>
+        </w:rPr>
+        <w:t>2</w:t>
+      </w:r>
+      <w:r>
+        <w:t xml:space="preserve">. </w:t>
+      </w:r>
+      <w:r>
+        <w:rPr>
+          <w:rFonts w:hint="eastAsia"/>
+        </w:rPr>
+        <w:t xml:space="preserve">시간에 따른 </w:t>
+      </w:r>
+      <w:r>
+        <w:t xml:space="preserve">IQ imbalance </w:t>
+      </w:r>
+      <w:r>
+        <w:rPr>
+          <w:rFonts w:hint="eastAsia"/>
+        </w:rPr>
+        <w:t xml:space="preserve">변화를 학습가능하다 </w:t>
+      </w:r>
+      <w:r>
+        <w:t>(</w:t>
+      </w:r>
+      <w:r>
+        <w:rPr>
+          <w:rFonts w:hint="eastAsia"/>
+        </w:rPr>
+        <w:t>이게.</w:t>
+      </w:r>
+      <w:r>
+        <w:t xml:space="preserve">. RF signal </w:t>
+      </w:r>
+      <w:r>
+        <w:rPr>
+          <w:rFonts w:hint="eastAsia"/>
+        </w:rPr>
+        <w:t>기반이면,</w:t>
+      </w:r>
+      <w:r>
+        <w:t xml:space="preserve"> </w:t>
+      </w:r>
+      <w:r>
+        <w:rPr>
+          <w:rFonts w:hint="eastAsia"/>
+        </w:rPr>
+        <w:t>각 시간에 따른 값이 바로 나오는데,</w:t>
+      </w:r>
+      <w:r>
+        <w:t xml:space="preserve"> IQ imbalance </w:t>
+      </w:r>
+      <w:r>
+        <w:rPr>
+          <w:rFonts w:hint="eastAsia"/>
+        </w:rPr>
+        <w:t>변화가 학습가능하다는게 장점이 되는건가요?</w:t>
+      </w:r>
+      <w:r>
+        <w:t>)</w:t>
+      </w:r>
+    </w:p>
+  </w:comment>
+  <w:comment w:id="4" w:author="김진관" w:date="2025-07-30T18:09:00Z" w:initials="김">
+    <w:p>
+      <w:pPr>
+        <w:pStyle w:val="ab"/>
+      </w:pPr>
+      <w:r>
+        <w:rPr>
+          <w:rStyle w:val="aa"/>
+        </w:rPr>
+        <w:annotationRef/>
+      </w:r>
+      <w:r>
+        <w:t>1. ‘</w:t>
+      </w:r>
+      <w:r>
+        <w:rPr>
+          <w:rFonts w:hint="eastAsia"/>
+        </w:rPr>
+        <w:t xml:space="preserve">비선형적인 </w:t>
+      </w:r>
+      <w:r>
+        <w:t>IQ imbalance</w:t>
+      </w:r>
+      <w:r>
+        <w:rPr>
+          <w:rFonts w:hint="eastAsia"/>
+        </w:rPr>
+        <w:t>에 효과적으로 대응할 수 있다.</w:t>
+      </w:r>
+      <w:r>
+        <w:t xml:space="preserve">’ </w:t>
+      </w:r>
+      <w:r>
+        <w:sym w:font="Wingdings" w:char="F0E0"/>
+      </w:r>
+      <w:r>
+        <w:t xml:space="preserve"> IQ imbalance</w:t>
+      </w:r>
+      <w:r>
+        <w:rPr>
+          <w:rFonts w:hint="eastAsia"/>
+        </w:rPr>
+        <w:t>를 잘 보상한다는 의미임</w:t>
+      </w:r>
+    </w:p>
+    <w:p>
+      <w:pPr>
+        <w:pStyle w:val="ab"/>
+        <w:rPr>
+          <w:rFonts w:hint="eastAsia"/>
+        </w:rPr>
+      </w:pPr>
+      <w:r>
+        <w:rPr>
+          <w:rFonts w:hint="eastAsia"/>
+        </w:rPr>
+        <w:t>2. 맞음</w:t>
+      </w:r>
+    </w:p>
+  </w:comment>
+  <w:comment w:id="5" w:author="ADMIN" w:date="2025-07-28T08:10:00Z" w:initials="A">
+    <w:p>
+      <w:pPr>
+        <w:pStyle w:val="ab"/>
+      </w:pPr>
+      <w:r>
+        <w:rPr>
+          <w:rStyle w:val="aa"/>
+        </w:rPr>
+        <w:annotationRef/>
+      </w:r>
+      <w:r>
+        <w:rPr>
+          <w:rFonts w:hint="eastAsia"/>
+        </w:rPr>
+        <w:t>궁금한 게 있는데,</w:t>
+      </w:r>
+      <w:r>
+        <w:t xml:space="preserve"> </w:t>
+      </w:r>
+      <w:r>
+        <w:rPr>
+          <w:rFonts w:hint="eastAsia"/>
+        </w:rPr>
+        <w:t xml:space="preserve">여기서 </w:t>
+      </w:r>
+      <w:r>
+        <w:t xml:space="preserve">FFT </w:t>
+      </w:r>
+      <w:r>
+        <w:rPr>
+          <w:rFonts w:hint="eastAsia"/>
+        </w:rPr>
+        <w:t>s</w:t>
+      </w:r>
+      <w:r>
+        <w:t>ize</w:t>
+      </w:r>
+      <w:r>
+        <w:rPr>
+          <w:rFonts w:hint="eastAsia"/>
+        </w:rPr>
+        <w:t xml:space="preserve">가 </w:t>
+      </w:r>
+      <w:r>
+        <w:t xml:space="preserve">32 </w:t>
+      </w:r>
+      <w:r>
+        <w:rPr>
+          <w:rFonts w:hint="eastAsia"/>
+        </w:rPr>
+        <w:t>라는 것과,</w:t>
+      </w:r>
+      <w:r>
+        <w:t xml:space="preserve"> </w:t>
+      </w:r>
+      <w:r>
+        <w:rPr>
+          <w:rFonts w:hint="eastAsia"/>
+        </w:rPr>
+        <w:t xml:space="preserve">은닉층이 </w:t>
+      </w:r>
+      <w:r>
+        <w:t>70, 90</w:t>
+      </w:r>
+      <w:r>
+        <w:rPr>
+          <w:rFonts w:hint="eastAsia"/>
+        </w:rPr>
+        <w:t>개 라는 한정이 있는데</w:t>
+      </w:r>
+      <w:r>
+        <w:br/>
+      </w:r>
+      <w:r>
+        <w:rPr>
+          <w:rFonts w:hint="eastAsia"/>
+        </w:rPr>
+        <w:t xml:space="preserve">이건 논문에서는 일반적인 변수 </w:t>
+      </w:r>
+      <w:r>
+        <w:t xml:space="preserve">(N, M) </w:t>
+      </w:r>
+      <w:r>
+        <w:rPr>
+          <w:rFonts w:hint="eastAsia"/>
+        </w:rPr>
+        <w:t>등으로 표현하고,</w:t>
+      </w:r>
+      <w:r>
+        <w:t xml:space="preserve"> simulation </w:t>
+      </w:r>
+      <w:r>
+        <w:rPr>
+          <w:rFonts w:hint="eastAsia"/>
+        </w:rPr>
+        <w:t>결과 쪽에서 특정 상수 값이 나와야 하는 거 아닌가요?</w:t>
+      </w:r>
+    </w:p>
+    <w:p>
+      <w:pPr>
+        <w:pStyle w:val="ab"/>
+      </w:pPr>
+      <w:r>
+        <w:rPr>
+          <w:rFonts w:hint="eastAsia"/>
+        </w:rPr>
+        <w:t>아니면 이 다음 문단부터 통으로 다 시뮬레이션 결과 쪽으로 옮기면 될까요?</w:t>
+      </w:r>
+    </w:p>
+  </w:comment>
+  <w:comment w:id="6" w:author="김진관" w:date="2025-07-30T18:13:00Z" w:initials="김">
+    <w:p>
+      <w:pPr>
+        <w:pStyle w:val="ab"/>
+      </w:pPr>
+      <w:r>
+        <w:rPr>
+          <w:rStyle w:val="aa"/>
+        </w:rPr>
+        <w:annotationRef/>
+      </w:r>
+      <w:r>
+        <w:rPr>
+          <w:rFonts w:hint="eastAsia"/>
+        </w:rPr>
+        <w:t xml:space="preserve">변수 </w:t>
+      </w:r>
+      <w:r>
+        <w:t>(N, M)</w:t>
+      </w:r>
+      <w:r>
+        <w:rPr>
+          <w:rFonts w:hint="eastAsia"/>
+        </w:rPr>
+        <w:t xml:space="preserve"> 같이 표현하고,</w:t>
+      </w:r>
+      <w:r>
+        <w:t xml:space="preserve"> simulation </w:t>
+      </w:r>
+      <w:r>
+        <w:rPr>
+          <w:rFonts w:hint="eastAsia"/>
+        </w:rPr>
+        <w:t>결과 쪽에서 구체적인 값을 언급하는게 맞음</w:t>
+      </w:r>
+      <w:bookmarkStart w:id="7" w:name="_GoBack"/>
+      <w:bookmarkEnd w:id="7"/>
+    </w:p>
+  </w:comment>
+</w:comments>
+</file>
+
+<file path=word/commentsExtended.xml><?xml version="1.0" encoding="utf-8"?>
+<w15:commentsEx xmlns:wpc="http://schemas.microsoft.com/office/word/2010/wordprocessingCanvas" xmlns:cx="http://schemas.microsoft.com/office/drawing/2014/chartex" xmlns:cx1="http://schemas.microsoft.com/office/drawing/2015/9/8/chartex" xmlns:mc="http://schemas.openxmlformats.org/markup-compatibility/2006" xmlns:o="urn:schemas-microsoft-com:office:office" xmlns:r="http://schemas.openxmlformats.org/officeDocument/2006/relationships" xmlns:m="http://schemas.openxmlformats.org/officeDocument/2006/math" xmlns:v="urn:schemas-microsoft-com:vml" xmlns:wp14="http://schemas.microsoft.com/office/word/2010/wordprocessingDrawing" xmlns:wp="http://schemas.openxmlformats.org/drawingml/2006/wordprocessingDrawing" xmlns:w10="urn:schemas-microsoft-com:office:word" xmlns:w="http://schemas.openxmlformats.org/wordprocessingml/2006/main" xmlns:w14="http://schemas.microsoft.com/office/word/2010/wordml" xmlns:w15="http://schemas.microsoft.com/office/word/2012/wordml" xmlns:w16se="http://schemas.microsoft.com/office/word/2015/wordml/symex" xmlns:wpg="http://schemas.microsoft.com/office/word/2010/wordprocessingGroup" xmlns:wpi="http://schemas.microsoft.com/office/word/2010/wordprocessingInk" xmlns:wne="http://schemas.microsoft.com/office/word/2006/wordml" xmlns:wps="http://schemas.microsoft.com/office/word/2010/wordprocessingShape" mc:Ignorable="w14 w15 w16se wp14">
+  <w15:commentEx w15:paraId="63266387" w15:done="0"/>
+  <w15:commentEx w15:paraId="078F4391" w15:done="0"/>
+  <w15:commentEx w15:paraId="6AA84399" w15:paraIdParent="078F4391" w15:done="0"/>
+  <w15:commentEx w15:paraId="748016A8" w15:done="0"/>
+  <w15:commentEx w15:paraId="186F24A9" w15:paraIdParent="748016A8" w15:done="0"/>
+  <w15:commentEx w15:paraId="570DD69E" w15:done="0"/>
+  <w15:commentEx w15:paraId="2839A262" w15:paraIdParent="570DD69E" w15:done="0"/>
+</w15:commentsEx>
+</file>
+
+<file path=word/commentsExtensible.xml><?xml version="1.0" encoding="utf-8"?>
+<w16cex:commentsExtensible xmlns:wpc="http://schemas.microsoft.com/office/word/2010/wordprocessingCanvas" xmlns:cx="http://schemas.microsoft.com/office/drawing/2014/chartex" xmlns:cx1="http://schemas.microsoft.com/office/drawing/2015/9/8/chartex" xmlns:cx2="http://schemas.microsoft.com/office/drawing/2015/10/21/chartex" xmlns:cx3="http://schemas.microsoft.com/office/drawing/2016/5/9/chartex" xmlns:cx4="http://schemas.microsoft.com/office/drawing/2016/5/10/chartex" xmlns:cx5="http://schemas.microsoft.com/office/drawing/2016/5/11/chartex" xmlns:cx6="http://schemas.microsoft.com/office/drawing/2016/5/12/chartex" xmlns:cx7="http://schemas.microsoft.com/office/drawing/2016/5/13/chartex" xmlns:cx8="http://schemas.microsoft.com/office/drawing/2016/5/14/chartex" xmlns:mc="http://schemas.openxmlformats.org/markup-compatibility/2006" xmlns:aink="http://schemas.microsoft.com/office/drawing/2016/ink" xmlns:am3d="http://schemas.microsoft.com/office/drawing/2017/model3d" xmlns:o="urn:schemas-microsoft-com:office:office" xmlns:r="http://schemas.openxmlformats.org/officeDocument/2006/relationships" xmlns:m="http://schemas.openxmlformats.org/officeDocument/2006/math" xmlns:v="urn:schemas-microsoft-com:vml" xmlns:wp14="http://schemas.microsoft.com/office/word/2010/wordprocessingDrawing" xmlns:wp="http://schemas.openxmlformats.org/drawingml/2006/wordprocessingDrawing" xmlns:w10="urn:schemas-microsoft-com:office:word" xmlns:w="http://schemas.openxmlformats.org/wordprocessingml/2006/main" xmlns:w14="http://schemas.microsoft.com/office/word/2010/wordml" xmlns:w15="http://schemas.microsoft.com/office/word/2012/wordml" xmlns:w16cex="http://schemas.microsoft.com/office/word/2018/wordml/cex" xmlns:w16cid="http://schemas.microsoft.com/office/word/2016/wordml/cid" xmlns:w16="http://schemas.microsoft.com/office/word/2018/wordml" xmlns:w16sdtdh="http://schemas.microsoft.com/office/word/2020/wordml/sdtdatahash" xmlns:w16se="http://schemas.microsoft.com/office/word/2015/wordml/symex" xmlns:wpg="http://schemas.microsoft.com/office/word/2010/wordprocessingGroup" xmlns:wpi="http://schemas.microsoft.com/office/word/2010/wordprocessingInk" xmlns:wne="http://schemas.microsoft.com/office/word/2006/wordml" xmlns:wps="http://schemas.microsoft.com/office/word/2010/wordprocessingShape" mc:Ignorable="w14 w15 w16se w16cid w16 w16cex w16sdtdh wp14">
+  <w16cex:commentExtensible w16cex:durableId="2C31AE17" w16cex:dateUtc="2025-07-27T23:06:00Z"/>
+  <w16cex:commentExtensible w16cex:durableId="2C31AE24" w16cex:dateUtc="2025-07-27T23:07:00Z"/>
+  <w16cex:commentExtensible w16cex:durableId="2C31AE91" w16cex:dateUtc="2025-07-27T23:08:00Z"/>
+  <w16cex:commentExtensible w16cex:durableId="2C31AF0E" w16cex:dateUtc="2025-07-27T23:10:00Z"/>
+</w16cex:commentsExtensible>
+</file>
+
+<file path=word/commentsIds.xml><?xml version="1.0" encoding="utf-8"?>
+<w16cid:commentsIds xmlns:wpc="http://schemas.microsoft.com/office/word/2010/wordprocessingCanvas" xmlns:cx="http://schemas.microsoft.com/office/drawing/2014/chartex" xmlns:cx1="http://schemas.microsoft.com/office/drawing/2015/9/8/chartex" xmlns:cx2="http://schemas.microsoft.com/office/drawing/2015/10/21/chartex" xmlns:cx3="http://schemas.microsoft.com/office/drawing/2016/5/9/chartex" xmlns:cx4="http://schemas.microsoft.com/office/drawing/2016/5/10/chartex" xmlns:cx5="http://schemas.microsoft.com/office/drawing/2016/5/11/chartex" xmlns:cx6="http://schemas.microsoft.com/office/drawing/2016/5/12/chartex" xmlns:cx7="http://schemas.microsoft.com/office/drawing/2016/5/13/chartex" xmlns:cx8="http://schemas.microsoft.com/office/drawing/2016/5/14/chartex" xmlns:mc="http://schemas.openxmlformats.org/markup-compatibility/2006" xmlns:aink="http://schemas.microsoft.com/office/drawing/2016/ink" xmlns:am3d="http://schemas.microsoft.com/office/drawing/2017/model3d" xmlns:o="urn:schemas-microsoft-com:office:office" xmlns:r="http://schemas.openxmlformats.org/officeDocument/2006/relationships" xmlns:m="http://schemas.openxmlformats.org/officeDocument/2006/math" xmlns:v="urn:schemas-microsoft-com:vml" xmlns:wp14="http://schemas.microsoft.com/office/word/2010/wordprocessingDrawing" xmlns:wp="http://schemas.openxmlformats.org/drawingml/2006/wordprocessingDrawing" xmlns:w10="urn:schemas-microsoft-com:office:word" xmlns:w="http://schemas.openxmlformats.org/wordprocessingml/2006/main" xmlns:w14="http://schemas.microsoft.com/office/word/2010/wordml" xmlns:w15="http://schemas.microsoft.com/office/word/2012/wordml" xmlns:w16cex="http://schemas.microsoft.com/office/word/2018/wordml/cex" xmlns:w16cid="http://schemas.microsoft.com/office/word/2016/wordml/cid" xmlns:w16="http://schemas.microsoft.com/office/word/2018/wordml" xmlns:w16sdtdh="http://schemas.microsoft.com/office/word/2020/wordml/sdtdatahash" xmlns:w16se="http://schemas.microsoft.com/office/word/2015/wordml/symex" xmlns:wpg="http://schemas.microsoft.com/office/word/2010/wordprocessingGroup" xmlns:wpi="http://schemas.microsoft.com/office/word/2010/wordprocessingInk" xmlns:wne="http://schemas.microsoft.com/office/word/2006/wordml" xmlns:wps="http://schemas.microsoft.com/office/word/2010/wordprocessingShape" mc:Ignorable="w14 w15 w16se w16cid w16 w16cex w16sdtdh wp14">
+  <w16cid:commentId w16cid:paraId="63266387" w16cid:durableId="2C31AE17"/>
+  <w16cid:commentId w16cid:paraId="078F4391" w16cid:durableId="2C31AE24"/>
+  <w16cid:commentId w16cid:paraId="38C14C0D" w16cid:durableId="2C31AE91"/>
+  <w16cid:commentId w16cid:paraId="570DD69E" w16cid:durableId="2C31AF0E"/>
+</w16cid:commentsIds>
 </file>
 
 <file path=word/endnotes.xml><?xml version="1.0" encoding="utf-8"?>
@@ -41693,6 +42276,17 @@
     <w:abstractNumId w:val="0"/>
   </w:num>
 </w:numbering>
+</file>
+
+<file path=word/people.xml><?xml version="1.0" encoding="utf-8"?>
+<w15:people xmlns:wpc="http://schemas.microsoft.com/office/word/2010/wordprocessingCanvas" xmlns:cx="http://schemas.microsoft.com/office/drawing/2014/chartex" xmlns:cx1="http://schemas.microsoft.com/office/drawing/2015/9/8/chartex" xmlns:mc="http://schemas.openxmlformats.org/markup-compatibility/2006" xmlns:o="urn:schemas-microsoft-com:office:office" xmlns:r="http://schemas.openxmlformats.org/officeDocument/2006/relationships" xmlns:m="http://schemas.openxmlformats.org/officeDocument/2006/math" xmlns:v="urn:schemas-microsoft-com:vml" xmlns:wp14="http://schemas.microsoft.com/office/word/2010/wordprocessingDrawing" xmlns:wp="http://schemas.openxmlformats.org/drawingml/2006/wordprocessingDrawing" xmlns:w10="urn:schemas-microsoft-com:office:word" xmlns:w="http://schemas.openxmlformats.org/wordprocessingml/2006/main" xmlns:w14="http://schemas.microsoft.com/office/word/2010/wordml" xmlns:w15="http://schemas.microsoft.com/office/word/2012/wordml" xmlns:w16se="http://schemas.microsoft.com/office/word/2015/wordml/symex" xmlns:wpg="http://schemas.microsoft.com/office/word/2010/wordprocessingGroup" xmlns:wpi="http://schemas.microsoft.com/office/word/2010/wordprocessingInk" xmlns:wne="http://schemas.microsoft.com/office/word/2006/wordml" xmlns:wps="http://schemas.microsoft.com/office/word/2010/wordprocessingShape" mc:Ignorable="w14 w15 w16se wp14">
+  <w15:person w15:author="ADMIN">
+    <w15:presenceInfo w15:providerId="None" w15:userId="ADMIN"/>
+  </w15:person>
+  <w15:person w15:author="김진관">
+    <w15:presenceInfo w15:providerId="Windows Live" w15:userId="80ac3891e776f4a0"/>
+  </w15:person>
+</w15:people>
 </file>
 
 <file path=word/styles.xml><?xml version="1.0" encoding="utf-8"?>
@@ -42291,6 +42885,94 @@
       <w:szCs w:val="24"/>
     </w:rPr>
   </w:style>
+  <w:style w:type="character" w:styleId="aa">
+    <w:name w:val="annotation reference"/>
+    <w:basedOn w:val="a0"/>
+    <w:uiPriority w:val="99"/>
+    <w:semiHidden/>
+    <w:unhideWhenUsed/>
+    <w:rsid w:val="00E31064"/>
+    <w:rPr>
+      <w:sz w:val="18"/>
+      <w:szCs w:val="18"/>
+    </w:rPr>
+  </w:style>
+  <w:style w:type="paragraph" w:styleId="ab">
+    <w:name w:val="annotation text"/>
+    <w:basedOn w:val="a"/>
+    <w:link w:val="Char1"/>
+    <w:uiPriority w:val="99"/>
+    <w:semiHidden/>
+    <w:unhideWhenUsed/>
+    <w:rsid w:val="00E31064"/>
+    <w:pPr>
+      <w:jc w:val="left"/>
+    </w:pPr>
+  </w:style>
+  <w:style w:type="character" w:customStyle="1" w:styleId="Char1">
+    <w:name w:val="메모 텍스트 Char"/>
+    <w:basedOn w:val="a0"/>
+    <w:link w:val="ab"/>
+    <w:uiPriority w:val="99"/>
+    <w:semiHidden/>
+    <w:rsid w:val="00E31064"/>
+  </w:style>
+  <w:style w:type="paragraph" w:styleId="ac">
+    <w:name w:val="annotation subject"/>
+    <w:basedOn w:val="ab"/>
+    <w:next w:val="ab"/>
+    <w:link w:val="Char2"/>
+    <w:uiPriority w:val="99"/>
+    <w:semiHidden/>
+    <w:unhideWhenUsed/>
+    <w:rsid w:val="00E31064"/>
+    <w:rPr>
+      <w:b/>
+      <w:bCs/>
+    </w:rPr>
+  </w:style>
+  <w:style w:type="character" w:customStyle="1" w:styleId="Char2">
+    <w:name w:val="메모 주제 Char"/>
+    <w:basedOn w:val="Char1"/>
+    <w:link w:val="ac"/>
+    <w:uiPriority w:val="99"/>
+    <w:semiHidden/>
+    <w:rsid w:val="00E31064"/>
+    <w:rPr>
+      <w:b/>
+      <w:bCs/>
+    </w:rPr>
+  </w:style>
+  <w:style w:type="paragraph" w:styleId="ad">
+    <w:name w:val="Balloon Text"/>
+    <w:basedOn w:val="a"/>
+    <w:link w:val="Char3"/>
+    <w:uiPriority w:val="99"/>
+    <w:semiHidden/>
+    <w:unhideWhenUsed/>
+    <w:rsid w:val="00DF7F7C"/>
+    <w:pPr>
+      <w:spacing w:after="0" w:line="240" w:lineRule="auto"/>
+    </w:pPr>
+    <w:rPr>
+      <w:rFonts w:asciiTheme="majorHAnsi" w:eastAsiaTheme="majorEastAsia" w:hAnsiTheme="majorHAnsi" w:cstheme="majorBidi"/>
+      <w:sz w:val="18"/>
+      <w:szCs w:val="18"/>
+    </w:rPr>
+  </w:style>
+  <w:style w:type="character" w:customStyle="1" w:styleId="Char3">
+    <w:name w:val="풍선 도움말 텍스트 Char"/>
+    <w:basedOn w:val="a0"/>
+    <w:link w:val="ad"/>
+    <w:uiPriority w:val="99"/>
+    <w:semiHidden/>
+    <w:rsid w:val="00DF7F7C"/>
+    <w:rPr>
+      <w:rFonts w:asciiTheme="majorHAnsi" w:eastAsiaTheme="majorEastAsia" w:hAnsiTheme="majorHAnsi" w:cstheme="majorBidi"/>
+      <w:sz w:val="18"/>
+      <w:szCs w:val="18"/>
+    </w:rPr>
+  </w:style>
 </w:styles>
 </file>
 
@@ -42560,7 +43242,7 @@
 </file>
 
 <file path=customXml/itemProps1.xml><?xml version="1.0" encoding="utf-8"?>
-<ds:datastoreItem xmlns:ds="http://schemas.openxmlformats.org/officeDocument/2006/customXml" ds:itemID="{E96CCC06-2DEA-4BC4-9815-1BFF3B72F1B8}">
+<ds:datastoreItem xmlns:ds="http://schemas.openxmlformats.org/officeDocument/2006/customXml" ds:itemID="{43FAD616-8029-448B-8A3C-1135FC175712}">
   <ds:schemaRefs>
     <ds:schemaRef ds:uri="http://schemas.openxmlformats.org/officeDocument/2006/bibliography"/>
   </ds:schemaRefs>

</xml_diff>